<commit_message>
Tách slide đề bài / lời giải cho Toán 10, 12; kiểm định mã năng lực số, năng lực AI trong KHBD theo Phụ lục 1
- Slide Toán 10, 12: mỗi ví dụ, bài tập thành 1 slide đề bài (có câu gợi mở) + 1 slide lời giải
- KHBD 10, 11, 12: đổi mã theo bảng chuẩn Phụ lục 1 (tr.95-96); gắn 5.2.NC1b; 2.5.NC1a cho củng cố online Taode_thi_online
- Sao thêm slide vào slide/ và giáo án vào giao_an/ theo quy chuẩn CLAUDE.md

Co-Authored-By: Claude Opus 5.5 <noreply@anthropic.com>
</commit_message>
<xml_diff>
--- a/giao_an/KHBD_TOAN11_Bai5_T11-12.docx
+++ b/giao_an/KHBD_TOAN11_Bai5_T11-12.docx
@@ -669,7 +669,7 @@
           <w:i/>
           <w:sz w:val="26"/>
         </w:rPr>
-        <w:t>c) Năng lực số (theo Khung năng lực số cho người học, bậc Nâng cao 1 – cấp THPT; gắn với Khung giáo dục AI – Quyết định 2422/QĐ-BGDĐT)</w:t>
+        <w:t>c) Năng lực số (Thông tư 02/2025/TT-BGDĐT, mức NC1 – THPT) và năng lực AI (Khung giáo dục AI – Quyết định 2422/QĐ-BGDĐT: NLa, NLb, NLc, NLd)</w:t>
       </w:r>
     </w:p>
     <w:p>
@@ -692,7 +692,7 @@
           <w:b/>
           <w:sz w:val="26"/>
         </w:rPr>
-        <w:t>1.2.NC1 – Đánh giá dữ liệu, thông tin và nội dung số:</w:t>
+        <w:t>3.1.NC1a – Phát triển nội dung số (đồ thị, hình vẽ động):</w:t>
       </w:r>
       <w:r>
         <w:rPr>
@@ -722,7 +722,7 @@
           <w:b/>
           <w:sz w:val="26"/>
         </w:rPr>
-        <w:t>6.3.NC1 – Đánh giá trí tuệ nhân tạo:</w:t>
+        <w:t>NLa, NLc – Năng lực AI: nhận biết giới hạn của AI; kiểm chứng, đối chiếu kết quả AI:</w:t>
       </w:r>
       <w:r>
         <w:rPr>
@@ -764,7 +764,7 @@
           <w:b/>
           <w:sz w:val="26"/>
         </w:rPr>
-        <w:t>6.2.NC1 – Sử dụng trí tuệ nhân tạo (có trách nhiệm):</w:t>
+        <w:t>NLb, NLc – Năng lực AI: đạo đức AI, trung thực học thuật; sử dụng công cụ AI phù hợp:</w:t>
       </w:r>
       <w:r>
         <w:rPr>
@@ -794,7 +794,7 @@
           <w:b/>
           <w:sz w:val="26"/>
         </w:rPr>
-        <w:t>3.1.NC1 – Phát triển nội dung số và 2.2.NC1 – Chia sẻ thông qua công nghệ số:</w:t>
+        <w:t>3.1.NC1b – Phát triển nội dung số (sản phẩm số) và 2.5.NC1a – Quy tắc ứng xử trên mạng:</w:t>
       </w:r>
       <w:r>
         <w:rPr>
@@ -802,6 +802,36 @@
           <w:sz w:val="26"/>
         </w:rPr>
         <w:t xml:space="preserve"> lập bảng tính, biểu đồ dãy số giá cà phê; chia sẻ sản phẩm trên lớp học trực tuyến (HĐ4).</w:t>
+      </w:r>
+    </w:p>
+    <w:p>
+      <w:pPr>
+        <w:spacing w:before="0" w:after="60" w:line="264" w:lineRule="auto"/>
+        <w:ind w:left="340" w:hanging="255"/>
+        <w:jc w:val="both"/>
+      </w:pPr>
+      <w:r>
+        <w:rPr>
+          <w:rFonts w:ascii="Times New Roman" w:hAnsi="Times New Roman" w:eastAsia="Times New Roman"/>
+          <w:sz w:val="26"/>
+        </w:rPr>
+        <w:t>-</w:t>
+        <w:tab/>
+      </w:r>
+      <w:r>
+        <w:rPr>
+          <w:rFonts w:ascii="Times New Roman" w:hAnsi="Times New Roman" w:eastAsia="Times New Roman"/>
+          <w:b/>
+          <w:sz w:val="26"/>
+        </w:rPr>
+        <w:t xml:space="preserve">5.2.NC1b; 2.5.NC1a – Củng cố, luyện tập bài học trên môi trường số; an toàn, trung thực khi làm bài trực tuyến: </w:t>
+      </w:r>
+      <w:r>
+        <w:rPr>
+          <w:rFonts w:ascii="Times New Roman" w:hAnsi="Times New Roman" w:eastAsia="Times New Roman"/>
+          <w:sz w:val="26"/>
+        </w:rPr>
+        <w:t xml:space="preserve">Sử dụng hệ thống luyện tập trực tuyến do giáo viên/tổ chuyên môn tổ chức để củng cố nội dung bài học, nhận phản hồi và tự đánh giá kết quả; thực hiện đúng quy tắc an toàn, bảo mật và trung thực trong môi trường số. (Củng cố – bài luyện tập trên hệ thống Taode_thi_online.)</w:t>
       </w:r>
     </w:p>
     <w:p>
@@ -9881,7 +9911,7 @@
           <w:rFonts w:ascii="Times New Roman" w:hAnsi="Times New Roman" w:eastAsia="Times New Roman"/>
           <w:sz w:val="26"/>
         </w:rPr>
-        <w:t xml:space="preserve"> HS vận dụng kiến thức về dãy số để giải bài tập theo mức độ phù hợp; phát hiện, sửa lỗi trong lời giải do AI tạo ra (6.3.NC1); dùng AI có kiểm chứng (6.2.NC1).</w:t>
+        <w:t xml:space="preserve"> HS vận dụng kiến thức về dãy số để giải bài tập theo mức độ phù hợp; phát hiện, sửa lỗi trong lời giải do AI tạo ra (NLa, NLc); dùng AI có kiểm chứng (NLc).</w:t>
       </w:r>
     </w:p>
     <w:p>
@@ -11131,7 +11161,7 @@
           <w:rFonts w:ascii="Times New Roman" w:hAnsi="Times New Roman" w:eastAsia="Times New Roman"/>
           <w:sz w:val="26"/>
         </w:rPr>
-        <w:t xml:space="preserve"> HS vận dụng dãy số để mô tả, giải thích tình huống thực tiễn (1.2.NC1, 3.1.NC1); sử dụng AI có trách nhiệm (6.2.NC1).</w:t>
+        <w:t xml:space="preserve"> HS vận dụng dãy số để mô tả, giải thích tình huống thực tiễn (1.3.NC1a, 3.1.NC1b); sử dụng AI có trách nhiệm (NLb).</w:t>
       </w:r>
     </w:p>
     <w:p>
@@ -11747,6 +11777,13 @@
           <w:sz w:val="26"/>
         </w:rPr>
         <w:t xml:space="preserve"> HS hệ thống lại kiến thức của bài bằng sơ đồ tư duy; tự đánh giá mức độ đạt yêu cầu cần đạt qua câu hỏi trắc nghiệm; biết bài học của tiết sau.</w:t>
+      </w:r>
+      <w:r>
+        <w:rPr>
+          <w:rFonts w:ascii="Times New Roman" w:hAnsi="Times New Roman" w:eastAsia="Times New Roman"/>
+          <w:sz w:val="26"/>
+        </w:rPr>
+        <w:t xml:space="preserve"> Sử dụng hệ thống luyện tập trực tuyến do giáo viên/tổ chuyên môn tổ chức để củng cố nội dung bài học, nhận phản hồi và tự đánh giá kết quả; thực hiện đúng quy tắc an toàn, bảo mật và trung thực trong môi trường số (5.2.NC1b; 2.5.NC1a).</w:t>
       </w:r>
     </w:p>
     <w:p>

</xml_diff>